<commit_message>
Surface macOS as a distinct IntelliCAD gap
macOS was grouped with web application and web editor on a single
'not available' row, which buried it - it reads as an afterthought
rather than as one of the three platforms a member simply cannot buy.

Split into separate rows for macOS, web, and Linux, each marked 'not
available at any price' so the contrast with the paid add-ons above
them (AI at ~$8K, Android at ~$8K) is explicit: some gaps have a
price, these have none.

Added the line that makes the point directly - IntelliCAD is
Windows-bound, and macOS, Linux and the browser are doors that stay
shut rather than options a member can buy. Comparison slide now reads
'Windows only' against our five platforms.
</commit_message>
<xml_diff>
--- a/docs/tejascad-mgmt-brief-review.docx
+++ b/docs/tejascad-mgmt-brief-review.docx
@@ -1539,13 +1539,13 @@
             </w:pPr>
             <w:r>
               <w:rPr>
-                <w:b w:val="false"/>
-                <w:bCs w:val="false"/>
-                <w:color w:val="1A1A1A"/>
-                <w:sz w:val="17"/>
-                <w:szCs w:val="17"/>
-              </w:rPr>
-              <w:t xml:space="preserve">Mac, web application, web editor</w:t>
+                <w:b/>
+                <w:bCs/>
+                <w:color w:val="1A1A1A"/>
+                <w:sz w:val="17"/>
+                <w:szCs w:val="17"/>
+              </w:rPr>
+              <w:t xml:space="preserve">macOS</w:t>
             </w:r>
           </w:p>
         </w:tc>
@@ -1572,7 +1572,125 @@
                 <w:sz w:val="17"/>
                 <w:szCs w:val="17"/>
               </w:rPr>
-              <w:t xml:space="preserve">Not available</w:t>
+              <w:t xml:space="preserve">Not available at any price</w:t>
+            </w:r>
+          </w:p>
+        </w:tc>
+      </w:tr>
+      <w:tr>
+        <w:trPr>
+          <w:tblHeader w:val="false"/>
+        </w:trPr>
+        <w:tc>
+          <w:tcPr>
+            <w:tcW w:type="dxa" w:w="4513"/>
+            <w:shd w:fill="FAF7F2" w:val="clear"/>
+            <w:tcMar>
+              <w:top w:type="dxa" w:w="60"/>
+              <w:left w:type="dxa" w:w="90"/>
+              <w:bottom w:type="dxa" w:w="60"/>
+              <w:right w:type="dxa" w:w="90"/>
+            </w:tcMar>
+          </w:tcPr>
+          <w:p>
+            <w:pPr>
+              <w:spacing w:after="0" w:before="0"/>
+            </w:pPr>
+            <w:r>
+              <w:rPr>
+                <w:b w:val="false"/>
+                <w:bCs w:val="false"/>
+                <w:color w:val="1A1A1A"/>
+                <w:sz w:val="17"/>
+                <w:szCs w:val="17"/>
+              </w:rPr>
+              <w:t xml:space="preserve">Web application and web editor</w:t>
+            </w:r>
+          </w:p>
+        </w:tc>
+        <w:tc>
+          <w:tcPr>
+            <w:tcW w:type="dxa" w:w="4513"/>
+            <w:shd w:fill="FAF7F2" w:val="clear"/>
+            <w:tcMar>
+              <w:top w:type="dxa" w:w="60"/>
+              <w:left w:type="dxa" w:w="90"/>
+              <w:bottom w:type="dxa" w:w="60"/>
+              <w:right w:type="dxa" w:w="90"/>
+            </w:tcMar>
+          </w:tcPr>
+          <w:p>
+            <w:pPr>
+              <w:spacing w:after="0" w:before="0"/>
+            </w:pPr>
+            <w:r>
+              <w:rPr>
+                <w:b/>
+                <w:bCs/>
+                <w:color w:val="1A1A1A"/>
+                <w:sz w:val="17"/>
+                <w:szCs w:val="17"/>
+              </w:rPr>
+              <w:t xml:space="preserve">Not available at any price</w:t>
+            </w:r>
+          </w:p>
+        </w:tc>
+      </w:tr>
+      <w:tr>
+        <w:trPr>
+          <w:tblHeader w:val="false"/>
+        </w:trPr>
+        <w:tc>
+          <w:tcPr>
+            <w:tcW w:type="dxa" w:w="4513"/>
+            <w:shd w:fill="FFFFFF" w:val="clear"/>
+            <w:tcMar>
+              <w:top w:type="dxa" w:w="60"/>
+              <w:left w:type="dxa" w:w="90"/>
+              <w:bottom w:type="dxa" w:w="60"/>
+              <w:right w:type="dxa" w:w="90"/>
+            </w:tcMar>
+          </w:tcPr>
+          <w:p>
+            <w:pPr>
+              <w:spacing w:after="0" w:before="0"/>
+            </w:pPr>
+            <w:r>
+              <w:rPr>
+                <w:b w:val="false"/>
+                <w:bCs w:val="false"/>
+                <w:color w:val="1A1A1A"/>
+                <w:sz w:val="17"/>
+                <w:szCs w:val="17"/>
+              </w:rPr>
+              <w:t xml:space="preserve">Linux</w:t>
+            </w:r>
+          </w:p>
+        </w:tc>
+        <w:tc>
+          <w:tcPr>
+            <w:tcW w:type="dxa" w:w="4513"/>
+            <w:shd w:fill="FFFFFF" w:val="clear"/>
+            <w:tcMar>
+              <w:top w:type="dxa" w:w="60"/>
+              <w:left w:type="dxa" w:w="90"/>
+              <w:bottom w:type="dxa" w:w="60"/>
+              <w:right w:type="dxa" w:w="90"/>
+            </w:tcMar>
+          </w:tcPr>
+          <w:p>
+            <w:pPr>
+              <w:spacing w:after="0" w:before="0"/>
+            </w:pPr>
+            <w:r>
+              <w:rPr>
+                <w:b/>
+                <w:bCs/>
+                <w:color w:val="1A1A1A"/>
+                <w:sz w:val="17"/>
+                <w:szCs w:val="17"/>
+              </w:rPr>
+              <w:t xml:space="preserve">Not available at any price</w:t>
             </w:r>
           </w:p>
         </w:tc>
@@ -1608,6 +1726,38 @@
           <w:szCs w:val="19"/>
         </w:rPr>
         <w:t xml:space="preserve"> — a codebase to staff, modify and re-merge at every version uptake.</w:t>
+      </w:r>
+    </w:p>
+    <w:p>
+      <w:pPr>
+        <w:spacing w:after="100" w:before="60"/>
+      </w:pPr>
+      <w:r>
+        <w:rPr>
+          <w:b/>
+          <w:bCs/>
+          <w:color w:val="1E3A5C"/>
+          <w:sz w:val="19"/>
+          <w:szCs w:val="19"/>
+        </w:rPr>
+        <w:t xml:space="preserve">IntelliCAD is Windows-bound.</w:t>
+      </w:r>
+      <w:r>
+        <w:rPr>
+          <w:sz w:val="19"/>
+          <w:szCs w:val="19"/>
+        </w:rPr>
+        <w:t xml:space="preserve"> macOS, Linux and the browser are not options a member can buy — </w:t>
+      </w:r>
+      <w:r>
+        <w:rPr>
+          <w:b/>
+          <w:bCs/>
+          <w:color w:val="1E3A5C"/>
+          <w:sz w:val="19"/>
+          <w:szCs w:val="19"/>
+        </w:rPr>
+        <w:t xml:space="preserve">they are doors that stay shut.</w:t>
       </w:r>
     </w:p>
     <w:p>
@@ -2230,13 +2380,13 @@
             </w:pPr>
             <w:r>
               <w:rPr>
-                <w:b w:val="false"/>
-                <w:bCs w:val="false"/>
-                <w:color w:val="1A1A1A"/>
-                <w:sz w:val="17"/>
-                <w:szCs w:val="17"/>
-              </w:rPr>
-              <w:t xml:space="preserve">Windows</w:t>
+                <w:b/>
+                <w:bCs/>
+                <w:color w:val="1A1A1A"/>
+                <w:sz w:val="17"/>
+                <w:szCs w:val="17"/>
+              </w:rPr>
+              <w:t xml:space="preserve">Windows only</w:t>
             </w:r>
           </w:p>
         </w:tc>
@@ -2263,7 +2413,7 @@
                 <w:sz w:val="17"/>
                 <w:szCs w:val="17"/>
               </w:rPr>
-              <w:t xml:space="preserve">Windows, Mac, Linux, web, Android</w:t>
+              <w:t xml:space="preserve">Windows, macOS, Linux, web, Android</w:t>
             </w:r>
           </w:p>
         </w:tc>

</xml_diff>

<commit_message>
Note AI leverage on the team slide, and where it does not apply
A 6-10 person team on Rs 1.75 crore over two years only holds if
development is AI-assisted, so the slide now says so - and cites the
evidence we already have rather than asserting it: Phase 0 delivered
~207 commits and a shipping viewer in six weeks that way.

Also drew the distinction that matters for hiring. AI leverage is
real on the commands, UI, tests and tooling layers - the Rs 50 lakh
line. It is much weaker on ODA and ACIS integration, performance
work, and vendor defect diagnosis, because those depend on closed
SDKs, profiling judgement and hardware iteration rather than on
patterns a model has seen. Those are the Rs 100 lakh line, and the
slide now says to hire them deliberately.

Framing this way means the budget reads as a considered plan rather
than an optimistic total, and it pre-empts the obvious question of
how six to ten people fit inside Rs 1.75 crore.
</commit_message>
<xml_diff>
--- a/docs/tejascad-mgmt-brief-review.docx
+++ b/docs/tejascad-mgmt-brief-review.docx
@@ -5247,6 +5247,28 @@
     </w:p>
     <w:p>
       <w:pPr>
+        <w:spacing w:after="100" w:before="60"/>
+      </w:pPr>
+      <w:r>
+        <w:rPr>
+          <w:b/>
+          <w:bCs/>
+          <w:color w:val="1E3A5C"/>
+          <w:sz w:val="19"/>
+          <w:szCs w:val="19"/>
+        </w:rPr>
+        <w:t xml:space="preserve">A team this size is viable because of how we are building.</w:t>
+      </w:r>
+      <w:r>
+        <w:rPr>
+          <w:sz w:val="19"/>
+          <w:szCs w:val="19"/>
+        </w:rPr>
+        <w:t xml:space="preserve"> Phase 0 delivered ~207 commits and a shipping viewer in six weeks with AI-assisted development — the UI, commands, tests and tooling layers move several times faster than they used to.</w:t>
+      </w:r>
+    </w:p>
+    <w:p>
+      <w:pPr>
         <w:spacing w:after="40" w:before="40"/>
         <w:ind w:left="360" w:hanging="200"/>
       </w:pPr>
@@ -5262,27 +5284,20 @@
       </w:r>
       <w:r>
         <w:rPr>
-          <w:sz w:val="19"/>
-          <w:szCs w:val="19"/>
-        </w:rPr>
-        <w:t xml:space="preserve">This is </w:t>
-      </w:r>
-      <w:r>
-        <w:rPr>
-          <w:b/>
-          <w:bCs/>
-          <w:color w:val="1E3A5C"/>
-          <w:sz w:val="19"/>
-          <w:szCs w:val="19"/>
-        </w:rPr>
-        <w:t xml:space="preserve">the team the next ActCAD engine needs regardless</w:t>
-      </w:r>
-      <w:r>
-        <w:rPr>
-          <w:sz w:val="19"/>
-          <w:szCs w:val="19"/>
-        </w:rPr>
-        <w:t xml:space="preserve"> — the platform shares it, it does not create it</w:t>
+          <w:b/>
+          <w:bCs/>
+          <w:color w:val="1E3A5C"/>
+          <w:sz w:val="19"/>
+          <w:szCs w:val="19"/>
+        </w:rPr>
+        <w:t xml:space="preserve">AI carries the commands and UI layer</w:t>
+      </w:r>
+      <w:r>
+        <w:rPr>
+          <w:sz w:val="19"/>
+          <w:szCs w:val="19"/>
+        </w:rPr>
+        <w:t xml:space="preserve"> — that is where the leverage is real</w:t>
       </w:r>
     </w:p>
     <w:p>
@@ -5302,20 +5317,60 @@
       </w:r>
       <w:r>
         <w:rPr>
-          <w:sz w:val="19"/>
-          <w:szCs w:val="19"/>
-        </w:rPr>
-        <w:t xml:space="preserve">Engine developers are the constraint: </w:t>
-      </w:r>
-      <w:r>
-        <w:rPr>
-          <w:b/>
-          <w:bCs/>
-          <w:color w:val="1E3A5C"/>
-          <w:sz w:val="19"/>
-          <w:szCs w:val="19"/>
-        </w:rPr>
-        <w:t xml:space="preserve">senior C++ and systems people, hired deliberately</w:t>
+          <w:b/>
+          <w:bCs/>
+          <w:color w:val="1E3A5C"/>
+          <w:sz w:val="19"/>
+          <w:szCs w:val="19"/>
+        </w:rPr>
+        <w:t xml:space="preserve">Engine work still needs people</w:t>
+      </w:r>
+      <w:r>
+        <w:rPr>
+          <w:sz w:val="19"/>
+          <w:szCs w:val="19"/>
+        </w:rPr>
+        <w:t xml:space="preserve"> — ODA and ACIS integration, performance, vendor defects. Hire these deliberately.</w:t>
+      </w:r>
+    </w:p>
+    <w:p>
+      <w:pPr>
+        <w:spacing w:after="40" w:before="40"/>
+        <w:ind w:left="360" w:hanging="200"/>
+      </w:pPr>
+      <w:r>
+        <w:rPr>
+          <w:b/>
+          <w:bCs/>
+          <w:color w:val="9A6B2F"/>
+          <w:sz w:val="19"/>
+          <w:szCs w:val="19"/>
+        </w:rPr>
+        <w:t xml:space="preserve">•   </w:t>
+      </w:r>
+      <w:r>
+        <w:rPr>
+          <w:sz w:val="19"/>
+          <w:szCs w:val="19"/>
+        </w:rPr>
+        <w:t xml:space="preserve">This is </w:t>
+      </w:r>
+      <w:r>
+        <w:rPr>
+          <w:b/>
+          <w:bCs/>
+          <w:color w:val="1E3A5C"/>
+          <w:sz w:val="19"/>
+          <w:szCs w:val="19"/>
+        </w:rPr>
+        <w:t xml:space="preserve">the team the next ActCAD engine needs regardless</w:t>
+      </w:r>
+      <w:r>
+        <w:rPr>
+          <w:sz w:val="19"/>
+          <w:szCs w:val="19"/>
+        </w:rPr>
+        <w:t xml:space="preserve"> — the platform shares it, it does not create it</w:t>
       </w:r>
     </w:p>
     <w:p>

</xml_diff>

<commit_message>
docs: correct the name slide on verified search evidence
TAKSHA's flagged conflict is real (Taksha AI & Robotics Pvt Ltd and
several robotics/engineering firms), but TAKSH is more crowded still —
four Indian software companies trade on it. TAKSHON is the only clean
option of the four.

Replaces the earlier "TAKSH and TAKSHON are the two to take forward"
line with a single recommendation, records what each search actually
returned, and notes that these are web searches rather than register
searches so IP India / USPTO / EUIPO clearance still stands as a gate.

Co-Authored-By: Claude Opus 5 <noreply@anthropic.com>
Claude-Session: https://claude.ai/code/session_017WwpUDDYt2XPB8Jkk7SG8T
</commit_message>
<xml_diff>
--- a/docs/tejascad-mgmt-brief-review.docx
+++ b/docs/tejascad-mgmt-brief-review.docx
@@ -7087,7 +7087,7 @@
                 <w:sz w:val="17"/>
                 <w:szCs w:val="17"/>
               </w:rPr>
-              <w:t xml:space="preserve">Note</w:t>
+              <w:t xml:space="preserve">What a search turns up</w:t>
             </w:r>
           </w:p>
         </w:tc>
@@ -7169,23 +7169,23 @@
             </w:pPr>
             <w:r>
               <w:rPr>
-                <w:b w:val="false"/>
-                <w:bCs w:val="false"/>
-                <w:color w:val="1A1A1A"/>
-                <w:sz w:val="17"/>
-                <w:szCs w:val="17"/>
-              </w:rPr>
-              <w:t xml:space="preserve">Most futuristic and ownable; </w:t>
-            </w:r>
-            <w:r>
-              <w:rPr>
-                <w:b/>
-                <w:bCs/>
-                <w:color w:val="1A1A1A"/>
-                <w:sz w:val="17"/>
-                <w:szCs w:val="17"/>
-              </w:rPr>
-              <w:t xml:space="preserve">strongest search position</w:t>
+                <w:b/>
+                <w:bCs/>
+                <w:color w:val="1A1A1A"/>
+                <w:sz w:val="17"/>
+                <w:szCs w:val="17"/>
+              </w:rPr>
+              <w:t xml:space="preserve">Clear</w:t>
+            </w:r>
+            <w:r>
+              <w:rPr>
+                <w:b w:val="false"/>
+                <w:bCs w:val="false"/>
+                <w:color w:val="1A1A1A"/>
+                <w:sz w:val="17"/>
+                <w:szCs w:val="17"/>
+              </w:rPr>
+              <w:t xml:space="preserve"> — no Indian technology company trading on the name</w:t>
             </w:r>
           </w:p>
         </w:tc>
@@ -7273,17 +7273,17 @@
                 <w:sz w:val="17"/>
                 <w:szCs w:val="17"/>
               </w:rPr>
-              <w:t xml:space="preserve">Shortest, sharpest wordmark</w:t>
-            </w:r>
-            <w:r>
-              <w:rPr>
-                <w:b w:val="false"/>
-                <w:bCs w:val="false"/>
-                <w:color w:val="1A1A1A"/>
-                <w:sz w:val="17"/>
-                <w:szCs w:val="17"/>
-              </w:rPr>
-              <w:t xml:space="preserve">; meaning maps exactly to what CAD does</w:t>
+              <w:t xml:space="preserve">Crowded</w:t>
+            </w:r>
+            <w:r>
+              <w:rPr>
+                <w:b w:val="false"/>
+                <w:bCs w:val="false"/>
+                <w:color w:val="1A1A1A"/>
+                <w:sz w:val="17"/>
+                <w:szCs w:val="17"/>
+              </w:rPr>
+              <w:t xml:space="preserve"> — four Indian software firms already use it</w:t>
             </w:r>
           </w:p>
         </w:tc>
@@ -7365,23 +7365,23 @@
             </w:pPr>
             <w:r>
               <w:rPr>
-                <w:b w:val="false"/>
-                <w:bCs w:val="false"/>
-                <w:color w:val="1A1A1A"/>
-                <w:sz w:val="17"/>
-                <w:szCs w:val="17"/>
-              </w:rPr>
-              <w:t xml:space="preserve">Premium and distinctly Indian — </w:t>
-            </w:r>
-            <w:r>
-              <w:rPr>
-                <w:b/>
-                <w:bCs/>
-                <w:color w:val="1A1A1A"/>
-                <w:sz w:val="17"/>
-                <w:szCs w:val="17"/>
-              </w:rPr>
-              <w:t xml:space="preserve">conflict risk with an adjacent engineering-AI name</w:t>
+                <w:b/>
+                <w:bCs/>
+                <w:color w:val="1A1A1A"/>
+                <w:sz w:val="17"/>
+                <w:szCs w:val="17"/>
+              </w:rPr>
+              <w:t xml:space="preserve">Conflict</w:t>
+            </w:r>
+            <w:r>
+              <w:rPr>
+                <w:b w:val="false"/>
+                <w:bCs w:val="false"/>
+                <w:color w:val="1A1A1A"/>
+                <w:sz w:val="17"/>
+                <w:szCs w:val="17"/>
+              </w:rPr>
+              <w:t xml:space="preserve"> — Taksha AI &amp; Robotics Pvt Ltd, plus robotics and engineering firms</w:t>
             </w:r>
           </w:p>
         </w:tc>
@@ -7469,7 +7469,7 @@
                 <w:sz w:val="17"/>
                 <w:szCs w:val="17"/>
               </w:rPr>
-              <w:t xml:space="preserve">Best BIM and infrastructure story; more crowded</w:t>
+              <w:t xml:space="preserve">Strong BIM story, but a common word in wide commercial use</w:t>
             </w:r>
           </w:p>
         </w:tc>
@@ -7482,6 +7482,28 @@
     </w:p>
     <w:p>
       <w:pPr>
+        <w:spacing w:after="100" w:before="60"/>
+      </w:pPr>
+      <w:r>
+        <w:rPr>
+          <w:b/>
+          <w:bCs/>
+          <w:color w:val="1E3A5C"/>
+          <w:sz w:val="19"/>
+          <w:szCs w:val="19"/>
+        </w:rPr>
+        <w:t xml:space="preserve">TAKSHON is the recommendation</w:t>
+      </w:r>
+      <w:r>
+        <w:rPr>
+          <w:sz w:val="19"/>
+          <w:szCs w:val="19"/>
+        </w:rPr>
+        <w:t xml:space="preserve"> — the only one of the four with room to own the category.</w:t>
+      </w:r>
+    </w:p>
+    <w:p>
+      <w:pPr>
         <w:spacing w:after="40" w:before="40"/>
         <w:ind w:left="360" w:hanging="200"/>
       </w:pPr>
@@ -7497,37 +7519,20 @@
       </w:r>
       <w:r>
         <w:rPr>
-          <w:b/>
-          <w:bCs/>
-          <w:color w:val="1E3A5C"/>
-          <w:sz w:val="19"/>
-          <w:szCs w:val="19"/>
-        </w:rPr>
-        <w:t xml:space="preserve">TAKSH</w:t>
-      </w:r>
-      <w:r>
-        <w:rPr>
-          <w:sz w:val="19"/>
-          <w:szCs w:val="19"/>
-        </w:rPr>
-        <w:t xml:space="preserve"> and </w:t>
-      </w:r>
-      <w:r>
-        <w:rPr>
-          <w:b/>
-          <w:bCs/>
-          <w:color w:val="1E3A5C"/>
-          <w:sz w:val="19"/>
-          <w:szCs w:val="19"/>
-        </w:rPr>
-        <w:t xml:space="preserve">TAKSHON</w:t>
-      </w:r>
-      <w:r>
-        <w:rPr>
-          <w:sz w:val="19"/>
-          <w:szCs w:val="19"/>
-        </w:rPr>
-        <w:t xml:space="preserve"> are the two to take forward</w:t>
+          <w:sz w:val="19"/>
+          <w:szCs w:val="19"/>
+        </w:rPr>
+        <w:t xml:space="preserve">Sub-brands follow naturally — </w:t>
+      </w:r>
+      <w:r>
+        <w:rPr>
+          <w:b/>
+          <w:bCs/>
+          <w:color w:val="1E3A5C"/>
+          <w:sz w:val="19"/>
+          <w:szCs w:val="19"/>
+        </w:rPr>
+        <w:t xml:space="preserve">Engine · Cloud · Forge · SDK</w:t>
       </w:r>
     </w:p>
     <w:p>
@@ -7550,43 +7555,34 @@
           <w:sz w:val="19"/>
           <w:szCs w:val="19"/>
         </w:rPr>
-        <w:t xml:space="preserve">Sub-brands follow naturally — </w:t>
-      </w:r>
-      <w:r>
-        <w:rPr>
-          <w:b/>
-          <w:bCs/>
-          <w:color w:val="1E3A5C"/>
-          <w:sz w:val="19"/>
-          <w:szCs w:val="19"/>
-        </w:rPr>
-        <w:t xml:space="preserve">Engine · Cloud · Forge · SDK</w:t>
-      </w:r>
-    </w:p>
-    <w:p>
-      <w:pPr>
-        <w:spacing w:after="40" w:before="40"/>
-        <w:ind w:left="360" w:hanging="200"/>
-      </w:pPr>
-      <w:r>
-        <w:rPr>
-          <w:b/>
-          <w:bCs/>
-          <w:color w:val="9A6B2F"/>
-          <w:sz w:val="19"/>
-          <w:szCs w:val="19"/>
-        </w:rPr>
-        <w:t xml:space="preserve">•   </w:t>
-      </w:r>
-      <w:r>
-        <w:rPr>
-          <w:b/>
-          <w:bCs/>
-          <w:color w:val="1E3A5C"/>
-          <w:sz w:val="19"/>
-          <w:szCs w:val="19"/>
-        </w:rPr>
-        <w:t xml:space="preserve">Trademark and domain clearance before anything external</w:t>
+        <w:t xml:space="preserve">These are web searches, </w:t>
+      </w:r>
+      <w:r>
+        <w:rPr>
+          <w:b/>
+          <w:bCs/>
+          <w:color w:val="1E3A5C"/>
+          <w:sz w:val="19"/>
+          <w:szCs w:val="19"/>
+        </w:rPr>
+        <w:t xml:space="preserve">not register searches</w:t>
+      </w:r>
+      <w:r>
+        <w:rPr>
+          <w:sz w:val="19"/>
+          <w:szCs w:val="19"/>
+        </w:rPr>
+        <w:t xml:space="preserve"> — IP India Classes 9 and 42, plus USPTO and EUIPO, </w:t>
+      </w:r>
+      <w:r>
+        <w:rPr>
+          <w:b/>
+          <w:bCs/>
+          <w:color w:val="1E3A5C"/>
+          <w:sz w:val="19"/>
+          <w:szCs w:val="19"/>
+        </w:rPr>
+        <w:t xml:space="preserve">before anything external</w:t>
       </w:r>
     </w:p>
     <w:p>

</xml_diff>